<commit_message>
A Menina Elefante: cap. 22 (Okinawa) reescrito pela autora e cronologia ajustada
- Cap. 22 passa a ser o texto da Luciana, 'O que sobrou quando deu
  errado' (agosto de 2020), com ajustes mínimos de nomes e formato.
- Cap. 21: saída da fábrica no fim de 2019 e lançamento no começo de 2020.
- Cap. 23: depois de Okinawa, o bico, o bungee (nov. 2020), a Lumi
  Digital (jun. 2021), a volta a Okinawa a passeio (set. 2021) e a COVID.
- Destaque do cap. 22, estrutura, Bíblia e decisões; .docx e PDF gerados.

Co-Authored-By: Claude Opus 5.5 <noreply@anthropic.com>
Claude-Session: https://claude.ai/code/session_011ZTeK22H8KBNtWenzEUTZE
</commit_message>
<xml_diff>
--- a/menina_elefante/saidas/A_Menina_Elefante_V4.docx
+++ b/menina_elefante/saidas/A_Menina_Elefante_V4.docx
@@ -11056,7 +11056,7 @@
           <w:sz w:val="22"/>
           <w:szCs w:val="22"/>
         </w:rPr>
-        <w:t xml:space="preserve">2020–2022</w:t>
+        <w:t xml:space="preserve">2019–2022</w:t>
       </w:r>
     </w:p>
     <w:p>
@@ -11137,7 +11137,7 @@
           <w:sz w:val="19"/>
           <w:szCs w:val="19"/>
         </w:rPr>
-        <w:t xml:space="preserve">CAPÍTULO 21 · 2020–2021</w:t>
+        <w:t xml:space="preserve">CAPÍTULO 21 · 2019–2020</w:t>
       </w:r>
     </w:p>
     <w:p>
@@ -11207,7 +11207,7 @@
     </w:p>
     <w:p>
       <w:r>
-        <w:t xml:space="preserve">Eu fui a segunda. Numa noite de 2020, depois que minha mãe voltou para o Brasil e o apartamento ficou grande demais para quatro pessoas, eu comprei um curso de marketing digital. Oito mil reais, em doze vezes no cartão brasileiro que eu ainda tinha. Era muito dinheiro para a gente. Era o dinheiro de uma passagem para o Brasil. Eu comprei às duas da manhã, deitada no futon, com o Kousuke dormindo do lado, e só contei a ele no dia seguinte, no ônibus da empreiteira, falando baixo para os outros não ouvirem.</w:t>
+        <w:t xml:space="preserve">Eu fui a segunda. Numa noite de 2019, com a minha mãe já em remissão, dormindo no quarto das meninas, eu comprei um curso de marketing digital. Oito mil reais, em doze vezes no cartão brasileiro que eu ainda tinha. Era muito dinheiro para a gente. Era o dinheiro de uma passagem para o Brasil. Eu comprei às duas da manhã, deitada no futon, com o Kousuke dormindo do lado, e só contei a ele no dia seguinte, no ônibus da empreiteira, falando baixo para os outros não ouvirem.</w:t>
       </w:r>
     </w:p>
     <w:p>
@@ -11502,71 +11502,17 @@
     </w:p>
     <w:p>
       <w:r>
-        <w:t xml:space="preserve">Saímos da fábrica sem plano B. Na última tarde, eu entreguei o uniforme cinza dobrado ao encarregado, que se curvou e disse alguma coisa educada que eu não entendi. Na saída, olhei para trás, para o galpão, e senti menos alívio do que medo.</w:t>
-      </w:r>
-    </w:p>
-    <w:p>
-      <w:r>
-        <w:t xml:space="preserve">O lançamento veio. Não foi um desastre. Algumas pessoas compraram. Algumas mandaram mensagens bonitas. Mas não sustentava a casa. Não pagava o aluguel e a escola e a parcela e o arroz. Não mudava tudo, como eu tinha imaginado nas noites de futon.</w:t>
-      </w:r>
-    </w:p>
-    <w:p>
-      <w:r>
-        <w:t xml:space="preserve">Naquele fim de ano, numa tarde de novembro, eu fui até uma ponte num vale e pulei de bungee jump pela primeira vez. Cinquenta metros. Ninguém entendeu por quê, e eu também não sabia explicar. Sabia que ia sozinha, com o meu medo, e que lá em cima ninguém podia pular por mim. Achei que ia morrer. Não morri.</w:t>
-      </w:r>
-    </w:p>
-    <w:p>
-      <w:pPr>
-        <w:keepNext/>
-        <w:spacing w:before="200" w:after="200"/>
-        <w:ind w:firstLine="0"/>
-        <w:jc w:val="center"/>
-      </w:pPr>
-      <w:r>
-        <w:t xml:space="preserve">*   *   *</w:t>
-      </w:r>
-    </w:p>
-    <w:p>
-      <w:pPr>
-        <w:ind w:firstLine="0"/>
-      </w:pPr>
-      <w:r>
-        <w:t xml:space="preserve">No dia 24 de junho de 2021, de manhã, eu estacionei na frente do zeimusho de Kariya, a repartição de impostos da região.</w:t>
-      </w:r>
-    </w:p>
-    <w:p>
-      <w:r>
-        <w:t xml:space="preserve">Era um prédio cinza, sem graça, como todas as repartições do mundo. Eu tinha na bolsa uma pasta de plástico com dois formulários, preenchidos a lápis primeiro e depois a caneta, com a ajuda de um vídeo no YouTube e de um dicionário de kanji: o kaigyō todoke, a comunicação de abertura de atividade como empresária individual, e o pedido de autorização para fazer a declaração de imposto "azul", a dos pequenos negócios. No campo do ramo de atividade eu tinha escrito, em letras de forma, DIGITAL MARKETING. No campo do nome comercial, depois de três semanas de dúvida, eu tinha escrito LUMI DIGITAL. O meu nome do meio. O que ninguém usava.</w:t>
-      </w:r>
-    </w:p>
-    <w:p>
-      <w:r>
-        <w:t xml:space="preserve">A funcionária do guichê leu os dois formulários com atenção, virou as folhas, conferiu os campos um por um. Pediu um documento. Olhou para mim. Pegou um carimbo redondo, azul, molhou na almofada e bateu uma vez em cada formulário, no canto de cima, com um barulho seco.</w:t>
-      </w:r>
-    </w:p>
-    <w:p>
-      <w:r>
-        <w:t xml:space="preserve">Depois me devolveu as cópias.</w:t>
-      </w:r>
-    </w:p>
-    <w:p>
-      <w:r>
-        <w:t xml:space="preserve">Eu saí do prédio, sentei no carro e fiquei olhando o carimbo. Era um círculo azul com a data dentro, em números japoneses, e o nome da repartição em kanji em volta. Era só um carimbo. Era a minha primeira empresa.</w:t>
-      </w:r>
-    </w:p>
-    <w:p>
-      <w:r>
-        <w:t xml:space="preserve">Tirei uma foto da folha em cima do volante, com cuidado para o reflexo do sol não apagar a data, e mandei para a minha mãe no Brasil, onde eram nove e pouco da noite.</w:t>
-      </w:r>
-    </w:p>
-    <w:p>
-      <w:r>
-        <w:t xml:space="preserve">Ela respondeu em menos de um minuto, como sempre.</w:t>
-      </w:r>
-    </w:p>
-    <w:p>
-      <w:r>
-        <w:t xml:space="preserve">"O que é isso, filha?"</w:t>
+        <w:t xml:space="preserve">Saímos da fábrica no fim de 2019, sem plano B. Na última tarde, eu entreguei o uniforme cinza dobrado ao encarregado, que se curvou e disse alguma coisa educada que eu não entendi. Na saída, olhei para trás, para o galpão, e senti menos alívio do que medo.</w:t>
+      </w:r>
+    </w:p>
+    <w:p>
+      <w:r>
+        <w:t xml:space="preserve">O lançamento veio no começo de 2020, na mesma semana em que o mundo começou a falar em pandemia. Não foi um desastre. Algumas pessoas compraram. Algumas mandaram mensagens bonitas. Mas não sustentava a casa. Não pagava o aluguel e a escola e a parcela e o arroz. Não mudava tudo, como eu tinha imaginado nas noites de futon.</w:t>
+      </w:r>
+    </w:p>
+    <w:p>
+      <w:r>
+        <w:t xml:space="preserve">Na noite em que fechamos as contas do lançamento, o Kousuke abriu o caderno de planilhas e, pela primeira vez, não começou uma aba nova. Ficou olhando a última linha, com o bilhete colado de durex na mesma página, e a luz de anel ainda montada no canto da sala, apagada.</w:t>
       </w:r>
     </w:p>
     <w:p>
@@ -11663,7 +11609,7 @@
           <w:sz w:val="22"/>
           <w:szCs w:val="22"/>
         </w:rPr>
-        <w:t xml:space="preserve">Aprendi duas coisas naquele tempo. A primeira: toda decisão grande tem um custo para quem está ao seu lado. O Kousuke entrou "por mim", e a cara que aparecia na tela era a dele. Eu devia ter perguntado mais vezes como ele estava. A segunda: não espere que todo mundo entenda o seu sonho. Minha mãe perguntou "o que é isso, filha?" diante do carimbo da minha primeira empresa. Nem sempre quem nos ama entende o que estamos construindo. E tudo bem.</w:t>
+        <w:t xml:space="preserve">Aprendi duas coisas naquele tempo. A primeira: toda decisão grande tem um custo para quem está ao seu lado. O Kousuke entrou "por mim", e a cara que aparecia na tela era a dele. Eu devia ter perguntado mais vezes como ele estava. A segunda: não espere que todo mundo entenda o seu sonho. No refeitório da fábrica, me perguntaram se era pirâmide. Nem sempre quem está perto entende o que estamos construindo. E tudo bem.</w:t>
       </w:r>
     </w:p>
     <w:p>
@@ -11757,7 +11703,7 @@
           <w:sz w:val="19"/>
           <w:szCs w:val="19"/>
         </w:rPr>
-        <w:t xml:space="preserve">CAPÍTULO 22 · 2021</w:t>
+        <w:t xml:space="preserve">CAPÍTULO 22 · 2020</w:t>
       </w:r>
     </w:p>
     <w:p>
@@ -11774,7 +11720,7 @@
           <w:sz w:val="34"/>
           <w:szCs w:val="34"/>
         </w:rPr>
-        <w:t xml:space="preserve">OKINAWA</w:t>
+        <w:t xml:space="preserve">O QUE SOBROU QUANDO DEU ERRADO</w:t>
       </w:r>
     </w:p>
     <w:p>
@@ -11785,216 +11731,265 @@
         <w:rPr>
           <w:smallCaps/>
         </w:rPr>
-        <w:t xml:space="preserve">O food truck era</w:t>
-      </w:r>
-      <w:r>
-        <w:t xml:space="preserve"> branco, tinha um toldo listrado de verde e amarelo e um problema no gerador que ninguém tinha mencionado na hora da compra.</w:t>
-      </w:r>
-    </w:p>
-    <w:p>
-      <w:r>
-        <w:t xml:space="preserve">A ideia tinha chegado antes de qualquer outra coisa, no meio de 2021, como chegam as ideias que dão certo nos filmes: de repente, inteira, brilhante. Okinawa. O turismo voltando depois do pior da pandemia. Praias, estradas, estacionamentos cheios de carros alugados. E um food truck com um prato que a gente mesmo inventou e batizou de Surf and Turf: uma tigela de arroz com alho, frutos do mar fritos por cima, peixe, lula e camarão, e torresmo a pururuca, e por cima de tudo um vinagrete de cebola roxa apimentada. O mar e a terra na mesma tigela. Okinawa come porco de todo jeito, a orelha, a barriga, o pé, mas ninguém ali tinha visto um torresmo estourar a pururuca.</w:t>
-      </w:r>
-    </w:p>
-    <w:p>
-      <w:r>
-        <w:t xml:space="preserve">— Torresmo com camarão? — disse o Kousuke, na primeira conversa. — Ninguém vai entender.</w:t>
-      </w:r>
-    </w:p>
-    <w:p>
-      <w:r>
-        <w:t xml:space="preserve">— Vão entender quando provarem.</w:t>
-      </w:r>
-    </w:p>
-    <w:p>
-      <w:r>
-        <w:t xml:space="preserve">— E se não provarem?</w:t>
-      </w:r>
-    </w:p>
-    <w:p>
-      <w:r>
-        <w:t xml:space="preserve">— Vão provar. É só pôr o alho no óleo perto da praia.</w:t>
-      </w:r>
-    </w:p>
-    <w:p>
-      <w:r>
-        <w:t xml:space="preserve">Era diferente. Era nosso. Não tinha empreiteira, não tinha uniforme cinza, não tinha peça. A gente acreditou, de verdade, com aquela crença que só se tem quando já se perdeu o medo de perder, porque já se perdeu quase tudo.</w:t>
-      </w:r>
-    </w:p>
-    <w:p>
-      <w:r>
-        <w:t xml:space="preserve">Fizemos um empréstimo. Mais de um milhão de ienes, entre o empréstimo e o que tinha sobrado da poupança. O Kousuke fez a planilha. A planilha fechava, desde que o turismo voltasse. Todo mundo dizia que o turismo ia voltar.</w:t>
-      </w:r>
-    </w:p>
-    <w:p>
-      <w:pPr>
-        <w:keepNext/>
-        <w:spacing w:before="200" w:after="200"/>
-        <w:ind w:firstLine="0"/>
-        <w:jc w:val="center"/>
-      </w:pPr>
-      <w:r>
-        <w:t xml:space="preserve">*   *   *</w:t>
-      </w:r>
-    </w:p>
-    <w:p>
-      <w:pPr>
-        <w:ind w:firstLine="0"/>
-      </w:pPr>
-      <w:r>
-        <w:t xml:space="preserve">No começo de julho, a gente pegou o avião para Okinawa com as meninas.</w:t>
-      </w:r>
-    </w:p>
-    <w:p>
-      <w:r>
-        <w:t xml:space="preserve">Eu estava de chapéu de palha, máscara, calça branca, puxando uma mala de rodinha cor-de-rosa-choque que a Mity tinha escolhido, e a Ayumi segurava o cartão de embarque das duas como se fosse um documento de Estado. No saguão, enquanto a gente esperava, eu olhei pela janela os aviões parados e pensei que um avião precisa usar toda a força do motor para sair do chão. Depois que sobe, fica mais fácil. Pensei isso e fiquei com vergonha de ter pensado uma coisa tão bonita, e não disse para ninguém.</w:t>
-      </w:r>
-    </w:p>
-    <w:p>
-      <w:pPr>
-        <w:keepNext/>
-        <w:spacing w:before="200" w:after="200"/>
-        <w:ind w:firstLine="0"/>
-        <w:jc w:val="center"/>
-      </w:pPr>
-      <w:r>
-        <w:t xml:space="preserve">*   *   *</w:t>
-      </w:r>
-    </w:p>
-    <w:p>
-      <w:pPr>
-        <w:ind w:firstLine="0"/>
-      </w:pPr>
-      <w:r>
-        <w:t xml:space="preserve">As primeiras semanas foram de preparação. O truck, a licença, o fornecedor de frutos do mar, o óleo. O gerador que falhava. A cozinha do apartamento alugado virou um laboratório: a pele de porco secando numa grade para estourar depois, a panela de arroz com alho, a cebola roxa curtindo no vinagre com pimenta. A Ayumi e a Mity provavam o vinagrete com a ponta do dedo, faziam careta e pediam mais. O Kousuke fazia as contas e dirigia. Eu fritava.</w:t>
-      </w:r>
-    </w:p>
-    <w:p>
-      <w:r>
-        <w:t xml:space="preserve">Numa manhã de folga, alugamos pranchas de stand-up numa praia de água tão transparente que dava para ver as pedras e os corais lá no fundo, parecendo perto demais.</w:t>
-      </w:r>
-    </w:p>
-    <w:p>
-      <w:r>
-        <w:t xml:space="preserve">Aos vinte anos, eu teria entrado nadando até onde não desse pé. Naquela manhã, de pé em cima da prancha, com o remo na mão e as pernas tremendo, eu olhei para baixo e vi as pedras e pensei: e se eu cair? E se eu bater a cabeça? As meninas estavam na areia, com o Kousuke, fazendo castelo. Eu tinha duas filhas. Fiquei um tempo parada, sem remar, com o coração acelerado, sentindo todos os medos de uma mulher de trinta e dois anos que tem duas filhas e uma dívida.</w:t>
-      </w:r>
-    </w:p>
-    <w:p>
-      <w:r>
-        <w:t xml:space="preserve">Depois remei. Devagar. Não caí. No dia seguinte acordei com o corpo inteiro doendo, músculo por músculo, como se eu tivesse feito uma semana de academia em uma hora.</w:t>
-      </w:r>
-    </w:p>
-    <w:p>
-      <w:pPr>
-        <w:keepNext/>
-        <w:spacing w:before="200" w:after="200"/>
-        <w:ind w:firstLine="0"/>
-        <w:jc w:val="center"/>
-      </w:pPr>
-      <w:r>
-        <w:t xml:space="preserve">*   *   *</w:t>
-      </w:r>
-    </w:p>
-    <w:p>
-      <w:pPr>
-        <w:ind w:firstLine="0"/>
-      </w:pPr>
-      <w:r>
-        <w:t xml:space="preserve">A gente abriu numa sexta-feira.</w:t>
-      </w:r>
-    </w:p>
-    <w:p>
-      <w:r>
-        <w:t xml:space="preserve">Estacionamos num terreno perto de uma praia movimentada, montamos o toldo, ligamos o gerador, que funcionou na segunda tentativa. Joguei o primeiro punhado de alho no óleo. O cheiro subiu, aquele cheiro de almoço de domingo, de infância, de tia fritando torresmo para a família de doze irmãos, e eu fiquei com os olhos cheios d'água atrás da máscara.</w:t>
-      </w:r>
-    </w:p>
-    <w:p>
-      <w:r>
-        <w:t xml:space="preserve">Os primeiros clientes foram curiosos. Japoneses de férias que olhavam o cardápio com desconfiança, apontavam para a foto, experimentavam de pé, com a tigela de papel na mão e o torresmo estalando no dente, e faziam aquela cara de surpresa boa que os japoneses fazem quando uma coisa é melhor do que esperavam. Um senhor voltou no dia seguinte com a família inteira. Uma moça fotografou a tigela de todos os ângulos antes de comer.</w:t>
-      </w:r>
-    </w:p>
-    <w:p>
-      <w:r>
-        <w:t xml:space="preserve">— Agora vai — eu disse ao Kousuke, no fim do terceiro dia, contando o dinheiro da caixinha em cima do balcão.</w:t>
-      </w:r>
-    </w:p>
-    <w:p>
-      <w:r>
-        <w:t xml:space="preserve">Ele não disse nada. Estava olhando o celular.</w:t>
-      </w:r>
-    </w:p>
-    <w:p>
-      <w:r>
-        <w:t xml:space="preserve">Faltava uma semana para o feriado. A semana em que a gente ia ganhar em três dias o que planejava ganhar em um mês. A planilha dependia daquele feriado. O celular do Kousuke tinha uma notícia aberta: o número de casos tinha subido de novo, a província ia apertar as restrições, o estado de emergência ia ser estendido, o governo pedia que as pessoas não viajassem.</w:t>
-      </w:r>
-    </w:p>
-    <w:p>
-      <w:r>
-        <w:t xml:space="preserve">Nas semanas seguintes, as praias esvaziaram. Os estacionamentos esvaziaram. Os carros alugados sumiram. A gente continuou abrindo o truck, todos os dias, por teimosia, e vendia dez tigelas numa tarde inteira, e jogava fora o arroz que sobrava, e ligava o gerador que falhava para iluminar um terreno onde não havia ninguém.</w:t>
-      </w:r>
-    </w:p>
-    <w:p>
-      <w:r>
-        <w:t xml:space="preserve">Desmoronou. O negócio, o dinheiro, o sonho, a expectativa. Não de uma vez; foi desmoronando um pouco por dia, como a areia que a onda leva de baixo do pé.</w:t>
-      </w:r>
-    </w:p>
-    <w:p>
-      <w:pPr>
-        <w:keepNext/>
-        <w:spacing w:before="200" w:after="200"/>
-        <w:ind w:firstLine="0"/>
-        <w:jc w:val="center"/>
-      </w:pPr>
-      <w:r>
-        <w:t xml:space="preserve">*   *   *</w:t>
-      </w:r>
-    </w:p>
-    <w:p>
-      <w:pPr>
-        <w:ind w:firstLine="0"/>
-      </w:pPr>
-      <w:r>
-        <w:t xml:space="preserve">Quando a gente fechou de vez, sobrou a praia.</w:t>
-      </w:r>
-    </w:p>
-    <w:p>
-      <w:r>
-        <w:t xml:space="preserve">Era de graça. E, por algum motivo que eu não sei explicar, depois de fechar o truck, a gente não voltou logo para Aichi. Ficou. Mais algumas semanas, sem ter o que fazer, sem ter para onde correr, sem ter dinheiro para mais nada além do aluguel do apartamento e da comida. Ficou parado, pela primeira vez em anos.</w:t>
-      </w:r>
-    </w:p>
-    <w:p>
-      <w:r>
-        <w:t xml:space="preserve">As meninas iam para a água todo dia. O Kousuke lia debaixo de uma árvore. Eu ficava sentada na areia, olhando o mar, com a dívida no bolso como uma pedra.</w:t>
-      </w:r>
-    </w:p>
-    <w:p>
-      <w:r>
-        <w:t xml:space="preserve">No dia 8 de setembro, eu fiz trinta e três anos numa ilhazinha perto da costa, dessas que se atravessa de barco em quinze minutos. Subi de novo numa prancha de stand-up, sozinha, numa água tão rasa e tão azul que parecia de mentira, e tirei uma foto de mim mesma de cima, com o braço esticado, sorrindo, de óculos escuros e batom vermelho. Quem visse a foto ia achar que eu estava de férias.</w:t>
-      </w:r>
-    </w:p>
-    <w:p>
-      <w:r>
-        <w:t xml:space="preserve">À tarde, de volta à praia grande, eu deitei na areia e fechei os olhos. Senti uma coisa fria nos pés. Depois outra. Abri um olho. A Mity e a Ayumi estavam agachadas perto dos meus pés, com as mãos em concha, jogando areia molhada em cima deles, um punhado de cada vez, muito sérias, como quem faz um trabalho importante.</w:t>
-      </w:r>
-    </w:p>
-    <w:p>
-      <w:r>
-        <w:t xml:space="preserve">— O que vocês estão fazendo?</w:t>
-      </w:r>
-    </w:p>
-    <w:p>
-      <w:r>
-        <w:t xml:space="preserve">— Enterrando a mamãe — disse a Ayumi.</w:t>
-      </w:r>
-    </w:p>
-    <w:p>
-      <w:r>
-        <w:t xml:space="preserve">— Para ela não ir embora — disse a Mity.</w:t>
-      </w:r>
-    </w:p>
-    <w:p>
-      <w:r>
-        <w:t xml:space="preserve">Eu fechei o olho de novo e deixei.</w:t>
+        <w:t xml:space="preserve">Em três dias, vendemos</w:t>
+      </w:r>
+      <w:r>
+        <w:t xml:space="preserve"> um prato.</w:t>
+      </w:r>
+    </w:p>
+    <w:p>
+      <w:r>
+        <w:t xml:space="preserve">Um único prato, depois de tanta preparação, de tantas contas e de mais de um milhão de ienes que nem eram nossos. O dinheiro tinha vindo de cartão de crédito e empréstimos. A esperança tinha vindo de nós.</w:t>
+      </w:r>
+    </w:p>
+    <w:p>
+      <w:r>
+        <w:t xml:space="preserve">Quando chamei o Kousuke para sentar à mesa do apartamento que havíamos alugado em Okinawa, eu já sabia o que precisava dizer. O difícil era aceitar que dizer aquilo encerraria uma tentativa na qual tínhamos colocado muito mais do que dinheiro.</w:t>
+      </w:r>
+    </w:p>
+    <w:p>
+      <w:r>
+        <w:t xml:space="preserve">— Nesse ritmo, a gente não paga nem o custo do gerador. Vamos cair na real. Continuar insistindo vai aumentar o prejuízo. Precisamos fazer as contas e assumir. Não tem jeito.</w:t>
+      </w:r>
+    </w:p>
+    <w:p>
+      <w:r>
+        <w:t xml:space="preserve">É estranho lembrar que, pouco tempo antes, a nossa certeza era exatamente o contrário: não tinha como dar errado.</w:t>
+      </w:r>
+    </w:p>
+    <w:p>
+      <w:r>
+        <w:t xml:space="preserve">A ideia nasceu durante um jantar com a minha madrasta. Ela falou da vontade de abrir um restaurante em Okinawa, e nós logo quisemos entrar juntos. Para começar, decidimos testar algo menor, aparentemente mais simples e mais barato: um food truck para a temporada de verão.</w:t>
+      </w:r>
+    </w:p>
+    <w:p>
+      <w:r>
+        <w:t xml:space="preserve">A palavra “barato” parece outra coisa quando a gente olha para trás.</w:t>
+      </w:r>
+    </w:p>
+    <w:p>
+      <w:r>
+        <w:t xml:space="preserve">Nós já tínhamos tentado empreender no digital, com o lançamento de um curso sobre finanças que não trouxe retorno financeiro. Estávamos havia quase um ano fora da fábrica, sem seguro-desemprego, com duas filhas pequenas. A Ayumi tinha seis anos. A Mity, quatro. Não havia dinheiro sobrando para uma nova aposta.</w:t>
+      </w:r>
+    </w:p>
+    <w:p>
+      <w:r>
+        <w:t xml:space="preserve">Havia vontade. E havia aquela confiança de quem conhece marketing e começa a achar que saber vender uma ideia é suficiente para fazer um negócio funcionar.</w:t>
+      </w:r>
+    </w:p>
+    <w:p>
+      <w:r>
+        <w:t xml:space="preserve">Hoje consigo reconhecer o excesso nessa confiança. Na época, ele se parecia muito com coragem. A gente queria construir uma vida diferente, trabalhar por alguma coisa nossa, deixar de viver esperando a próxima oportunidade. E queria tanto que essa tentativa desse certo que os riscos foram ficando pequenos diante do futuro que imaginávamos.</w:t>
+      </w:r>
+    </w:p>
+    <w:p>
+      <w:r>
+        <w:t xml:space="preserve">Algumas licenças a minha madrasta já tinha. Encomendamos o food truck em Okinawa e providenciamos as demais autorizações para trabalhar com alimentos. Vieram os testes, as conversas sobre o cardápio, os ajustes até chegar ao prato que iríamos vender: Surf-and-Turf.</w:t>
+      </w:r>
+    </w:p>
+    <w:p>
+      <w:r>
+        <w:t xml:space="preserve">Arroz temperado com alho, camarão, lula e peixe fritos, torresmo pururuca do jeito brasileiro e picles de cebola roxa por cima.</w:t>
+      </w:r>
+    </w:p>
+    <w:p>
+      <w:r>
+        <w:t xml:space="preserve">Era muito bom. Disso eu continuo convencida.</w:t>
+      </w:r>
+    </w:p>
+    <w:p>
+      <w:r>
+        <w:t xml:space="preserve">E, na nossa cabeça, combinava perfeitamente com o lugar. Frutos do mar, uma praia de Okinawa, gente de férias procurando o que comer. Esperávamos que o feriado de agosto trouxesse de volta o movimento depois de um período tão difícil da pandemia. Alguns comércios estavam inoperantes; nós enxergávamos ali uma oportunidade de atender quem chegasse.</w:t>
+      </w:r>
+    </w:p>
+    <w:p>
+      <w:r>
+        <w:t xml:space="preserve">A hospedagem estava reservada para quase dois meses. As passagens da família, compradas. O food truck estava pronto, e a receita também. Não conseguimos garantir os ingredientes com os atacadistas da região, então abastecer o estoque seria uma das primeiras tarefas ao chegar.</w:t>
+      </w:r>
+    </w:p>
+    <w:p>
+      <w:r>
+        <w:t xml:space="preserve">Até o preço das passagens parecia confirmar a nossa previsão. Os assentos estavam acabando, os valores subindo. Interpretávamos aquilo como sinal de que a ilha ia encher.</w:t>
+      </w:r>
+    </w:p>
+    <w:p>
+      <w:r>
+        <w:t xml:space="preserve">Faltando uma semana para embarcar, começaram a chegar as notícias que nenhum entusiasmo nosso conseguia mudar.</w:t>
+      </w:r>
+    </w:p>
+    <w:p>
+      <w:r>
+        <w:t xml:space="preserve">A situação da pandemia estava piorando outra vez. Falava-se em novas restrições, em fechamento de comércios. E havia previsão de tufão justamente para o feriado em que esperávamos vender tanto.</w:t>
+      </w:r>
+    </w:p>
+    <w:p>
+      <w:r>
+        <w:t xml:space="preserve">O cenário que sustentava o nosso plano estava mudando antes mesmo de começarmos.</w:t>
+      </w:r>
+    </w:p>
+    <w:p>
+      <w:r>
+        <w:t xml:space="preserve">Ainda assim, fomos. E fizemos o que podíamos.</w:t>
+      </w:r>
+    </w:p>
+    <w:p>
+      <w:r>
+        <w:t xml:space="preserve">Preparávamos os pratos, parávamos nos pontos, procurávamos movimento. As praias e os calçadões estavam desertos. Carros da prefeitura passavam orientando as pessoas a ficar em casa. Voos eram cancelados. Os turistas que havíamos colocado nas nossas contas não estavam ali.</w:t>
+      </w:r>
+    </w:p>
+    <w:p>
+      <w:r>
+        <w:t xml:space="preserve">Chegamos a sair gritando, oferecendo a comida aos poucos moradores que ainda apareciam para aproveitar o sol e entrar no mar.</w:t>
+      </w:r>
+    </w:p>
+    <w:p>
+      <w:r>
+        <w:t xml:space="preserve">Quando o Kousuke conta essa parte, penso no quanto queríamos fazer funcionar. A comida estava pronta. Nós estávamos disponíveis para trabalhar. Mas a vontade de trabalhar não trazia de volta as pessoas que tinham deixado de viajar.</w:t>
+      </w:r>
+    </w:p>
+    <w:p>
+      <w:r>
+        <w:t xml:space="preserve">Depois de três dias e um prato vendido, precisávamos parar.</w:t>
+      </w:r>
+    </w:p>
+    <w:p>
+      <w:r>
+        <w:t xml:space="preserve">Foi então que nos sentamos naquela mesa.</w:t>
+      </w:r>
+    </w:p>
+    <w:p>
+      <w:r>
+        <w:t xml:space="preserve">Eu fui direta, como costumo ser quando uma situação exige uma decisão. Continuar custava dinheiro a cada dia, e já estávamos gastando o que não tínhamos. Insistir só para adiar o momento de admitir a perda faria a dívida crescer.</w:t>
+      </w:r>
+    </w:p>
+    <w:p>
+      <w:r>
+        <w:t xml:space="preserve">Mas fazer a conta do prejuízo era uma coisa. Ver o que aquela conta provocava no Kousuke era outra.</w:t>
+      </w:r>
+    </w:p>
+    <w:p>
+      <w:r>
+        <w:t xml:space="preserve">Anos depois, ao escrever sobre aquele agosto, ele contou que foi uma das primeiras vezes em que se sentiu sem chão. Vieram as perguntas: como pagaríamos a dívida? O que ele tinha feito? Como sair dali?</w:t>
+      </w:r>
+    </w:p>
+    <w:p>
+      <w:r>
+        <w:t xml:space="preserve">Ele ficou no quarto escuro, sem reação, sem saber o que falar, fazer ou comer. As meninas queriam brincar. Tinham quatro e seis anos. Para elas, o pai continuava sendo o pai, mesmo quando ele não sabia como responder ao que estava acontecendo.</w:t>
+      </w:r>
+    </w:p>
+    <w:p>
+      <w:r>
+        <w:t xml:space="preserve">Lendo o relato dele hoje, entendo melhor o peso daqueles dias. Na hora, a urgência de resolver pode ocupar tanto espaço que a gente demora a compreender a dor de quem está ao lado.</w:t>
+      </w:r>
+    </w:p>
+    <w:p>
+      <w:r>
+        <w:t xml:space="preserve">O Kousuke precisava se levantar. E eu queria que ele soubesse que ainda havia uma vida para continuarmos, mesmo sem aquele negócio.</w:t>
+      </w:r>
+    </w:p>
+    <w:p>
+      <w:r>
+        <w:t xml:space="preserve">— Acorda. Já estamos na pior. Se a gente ficar assim, vai ficar pior ainda. Levanta a cabeça. Assumir o prejuízo não é desistir da vida.</w:t>
+      </w:r>
+    </w:p>
+    <w:p>
+      <w:r>
+        <w:t xml:space="preserve">Foi uma fala firme. Ele a guardou como um daqueles empurrões que ajudam alguém a voltar a se mover quando já não encontra força sozinho.</w:t>
+      </w:r>
+    </w:p>
+    <w:p>
+      <w:r>
+        <w:t xml:space="preserve">Hoje ele me agradece por ter segurado as pontas. Eu recebo esse agradecimento com carinho, mas não quero contar essa lembrança como se eu tivesse sido forte o tempo todo e ele tivesse falhado. Nós dois acreditamos na ideia. Nós dois assumimos os riscos. O prejuízo pertencia aos dois.</w:t>
+      </w:r>
+    </w:p>
+    <w:p>
+      <w:r>
+        <w:t xml:space="preserve">Naqueles dias, consegui chamá-lo de volta. Em tantos outros momentos da nossa história, foi ele quem permaneceu ao meu lado, trabalhando, cuidando e oferecendo mais do que eu conseguia enxergar ou agradecer.</w:t>
+      </w:r>
+    </w:p>
+    <w:p>
+      <w:r>
+        <w:t xml:space="preserve">Talvez seja isso que me emocione tanto no texto dele: descobrir que um gesto meu ficou guardado como cuidado. E perceber, ao mesmo tempo, quantos gestos dele eu preciso aprender a reconhecer.</w:t>
+      </w:r>
+    </w:p>
+    <w:p>
+      <w:r>
+        <w:t xml:space="preserve">O negócio tinha acabado, mas nós ainda estávamos ali. O Kousuke, eu e as nossas duas meninas.</w:t>
+      </w:r>
+    </w:p>
+    <w:p>
+      <w:r>
+        <w:t xml:space="preserve">Já havíamos recomeçado antes. Quando fomos para o Brasil, quando voltamos para o Japão, tantas vezes com quase nada nas mãos. Okinawa nos colocava outra vez diante da necessidade de começar de novo. Agora, com uma dívida e com a experiência de uma tentativa que tinha dado errado.</w:t>
+      </w:r>
+    </w:p>
+    <w:p>
+      <w:r>
+        <w:t xml:space="preserve">Depois de cerca de dois dias, fomos conseguindo levantar a cabeça e pensar no que viria a seguir. Não tínhamos uma solução pronta. Tínhamos a decisão de procurar uma, juntos.</w:t>
+      </w:r>
+    </w:p>
+    <w:p>
+      <w:r>
+        <w:t xml:space="preserve">Nas duas semanas restantes, refletimos muito. E aproveitamos o tempo com as nossas filhas.</w:t>
+      </w:r>
+    </w:p>
+    <w:p>
+      <w:r>
+        <w:t xml:space="preserve">A praia, pelo menos, era de graça.</w:t>
+      </w:r>
+    </w:p>
+    <w:p>
+      <w:r>
+        <w:t xml:space="preserve">Há um humor meio triste nessa frase, mas ela também guarda uma lembrança boa. Depois de tanto calcular o movimento do feriado, tivemos tempo para estar com as meninas. Elas queriam brincar, ter o pai e a mãe por perto. Não conheciam o tamanho da dívida nem precisavam carregá-la conosco.</w:t>
+      </w:r>
+    </w:p>
+    <w:p>
+      <w:r>
+        <w:t xml:space="preserve">O Kousuke conta que enxugávamos as lágrimas e tentávamos transmitir segurança. “Papai e mamãe sabem o que estão fazendo.”</w:t>
+      </w:r>
+    </w:p>
+    <w:p>
+      <w:r>
+        <w:t xml:space="preserve">Nós estávamos aprendendo o que fazer. E, enquanto aprendíamos, continuávamos sendo os pais delas.</w:t>
+      </w:r>
+    </w:p>
+    <w:p>
+      <w:r>
+        <w:t xml:space="preserve">Hoje penso naquela família em Okinawa com mais ternura do que julgamento. Vejo a imprudência de algumas escolhas, a esperança que nos levou até lá e o susto quando o resultado veio tão diferente. Vejo também um casal que precisou interromper um plano sem interromper a própria história.</w:t>
+      </w:r>
+    </w:p>
+    <w:p>
+      <w:r>
+        <w:t xml:space="preserve">Eu não acredito que todo sonho precise dar errado antes de dar certo. Nem que uma dívida se torne boa só porque conseguimos aprender alguma coisa com ela. Aquela perda doeu e precisou ser assumida. Teríamos preferido aprender sem aquele custo.</w:t>
+      </w:r>
+    </w:p>
+    <w:p>
+      <w:r>
+        <w:t xml:space="preserve">Mas ela não explica tudo o que fomos capazes de viver depois.</w:t>
+      </w:r>
+    </w:p>
+    <w:p>
+      <w:r>
+        <w:t xml:space="preserve">Com a fé que tenho hoje, consigo olhar para aquele agosto e reconhecer o cuidado de Deus na nossa vida, mesmo num período em que eu ainda não compreendia esse cuidado como compreendo agora. Não preciso dizer que Ele provocou o prejuízo para acreditar que nos sustentou enquanto procurávamos um caminho.</w:t>
+      </w:r>
+    </w:p>
+    <w:p>
+      <w:r>
+        <w:t xml:space="preserve">Ao reler as palavras do Kousuke, volto à mesa daquele apartamento. À decisão difícil que tomamos. Às filhas pequenas que continuavam querendo brincar. Ao homem que se sentiu sem chão e, ainda assim, recomeçou comigo.</w:t>
+      </w:r>
+    </w:p>
+    <w:p>
+      <w:r>
+        <w:t xml:space="preserve">É por isso que agosto ficou na nossa memória.</w:t>
+      </w:r>
+    </w:p>
+    <w:p>
+      <w:r>
+        <w:t xml:space="preserve">Nós fomos para Okinawa esperando voltar com o dinheiro de um negócio que daria certo. Voltamos com um prejuízo para resolver e uma lembrança que ainda nos ajuda a entender o nosso casamento.</w:t>
+      </w:r>
+    </w:p>
+    <w:p>
+      <w:r>
+        <w:t xml:space="preserve">Quando o plano acabou, continuamos escolhendo ficar.</w:t>
       </w:r>
     </w:p>
     <w:p>
@@ -12067,7 +12062,7 @@
           <w:sz w:val="22"/>
           <w:szCs w:val="22"/>
         </w:rPr>
-        <w:t xml:space="preserve">Okinawa foi o lugar onde eu achei que tinha perdido tudo.</w:t>
+        <w:t xml:space="preserve">Talvez você também tenha uma tentativa que dói lembrar. Um negócio, uma mudança, um projeto no qual colocou dinheiro, tempo e uma parte grande de si.</w:t>
       </w:r>
     </w:p>
     <w:p>
@@ -12079,7 +12074,7 @@
           <w:sz w:val="22"/>
           <w:szCs w:val="22"/>
         </w:rPr>
-        <w:t xml:space="preserve">O dinheiro que a gente não tinha, a planilha que dependia de um feriado, o gerador falhando para iluminar um terreno vazio. Eu vendia dez tigelas numa tarde e jogava fora o arroz que sobrava. Parecia o fim.</w:t>
+        <w:t xml:space="preserve">Reconhecer a perda pode exigir mais coragem do que continuar. Especialmente quando insistir virou uma maneira de provar o seu valor.</w:t>
       </w:r>
     </w:p>
     <w:p>
@@ -12091,31 +12086,7 @@
           <w:sz w:val="22"/>
           <w:szCs w:val="22"/>
         </w:rPr>
-        <w:t xml:space="preserve">Mas foi ali também que eu parei pela primeira vez em anos. Sem ter para onde correr, sentei na areia. E minhas filhas, que eu achava que só precisavam de mim para coisas práticas, enterraram os meus pés para eu não ir embora.</w:t>
-      </w:r>
-    </w:p>
-    <w:p>
-      <w:pPr>
-        <w:ind w:left="340" w:right="340" w:firstLine="300"/>
-      </w:pPr>
-      <w:r>
-        <w:rPr>
-          <w:sz w:val="22"/>
-          <w:szCs w:val="22"/>
-        </w:rPr>
-        <w:t xml:space="preserve">O deserto não é o lugar onde Deus nos abandona. É o lugar onde Ele nos ensina a andar. Nem todo fracasso é um fim. Às vezes é só a descoberta de que você estava correndo para o lugar errado.</w:t>
-      </w:r>
-    </w:p>
-    <w:p>
-      <w:pPr>
-        <w:ind w:left="340" w:right="340" w:firstLine="300"/>
-      </w:pPr>
-      <w:r>
-        <w:rPr>
-          <w:sz w:val="22"/>
-          <w:szCs w:val="22"/>
-        </w:rPr>
-        <w:t xml:space="preserve">Se você está no seu Okinawa agora, com a dívida no bolso como uma pedra, olhe em volta. Pode haver alguém enterrando os seus pés para você ficar.</w:t>
+        <w:t xml:space="preserve">Olhando para Okinawa, eu consigo separar duas coisas que, naquela época, pareciam grudadas: um empreendimento que não funcionou e uma família que ainda tinha uma vida pela frente. Precisávamos encerrar um para poder cuidar melhor da outra.</w:t>
       </w:r>
     </w:p>
     <w:p>
@@ -12129,7 +12100,7 @@
           <w:szCs w:val="22"/>
           <w:i/>
         </w:rPr>
-        <w:t xml:space="preserve">O que o seu maior fracasso te ensinou que nenhum sucesso teria ensinado?</w:t>
+        <w:t xml:space="preserve">Existe alguma tentativa que você precisa encerrar? E quem está ao seu lado, oferecendo um cuidado que a sua preocupação talvez ainda não tenha deixado você perceber?</w:t>
       </w:r>
     </w:p>
     <w:p>
@@ -12203,7 +12174,7 @@
     </w:p>
     <w:p>
       <w:pPr>
-        <w:spacing w:before="900" w:after="0" w:line="1183" w:lineRule="exact"/>
+        <w:spacing w:before="900" w:after="0" w:line="1022" w:lineRule="exact"/>
         <w:ind w:firstLine="0"/>
         <w:jc w:val="left"/>
       </w:pPr>
@@ -12212,47 +12183,30 @@
           <w:rFonts w:ascii="Bebas Neue" w:hAnsi="Bebas Neue" w:cs="Bebas Neue"/>
           <w:caps/>
           <w:color w:val="A9A9A4"/>
-          <w:sz w:val="116"/>
-          <w:szCs w:val="116"/>
+          <w:sz w:val="100"/>
+          <w:szCs w:val="100"/>
         </w:rPr>
-        <w:t xml:space="preserve">PARA ELA </w:t>
+        <w:t xml:space="preserve">QUANDO O PLANO ACABOU, </w:t>
       </w:r>
       <w:r>
         <w:rPr>
           <w:rFonts w:ascii="Bebas Neue" w:hAnsi="Bebas Neue" w:cs="Bebas Neue"/>
           <w:caps/>
           <w:color w:val="FFFFFF"/>
-          <w:sz w:val="116"/>
-          <w:szCs w:val="116"/>
+          <w:sz w:val="100"/>
+          <w:szCs w:val="100"/>
         </w:rPr>
-        <w:t xml:space="preserve">NÃO IR EMBORA</w:t>
+        <w:t xml:space="preserve">CONTINUAMOS ESCOLHENDO FICAR</w:t>
       </w:r>
       <w:r>
         <w:rPr>
           <w:rFonts w:ascii="Bebas Neue" w:hAnsi="Bebas Neue" w:cs="Bebas Neue"/>
           <w:caps/>
           <w:color w:val="A9A9A4"/>
-          <w:sz w:val="116"/>
-          <w:szCs w:val="116"/>
+          <w:sz w:val="100"/>
+          <w:szCs w:val="100"/>
         </w:rPr>
         <w:t xml:space="preserve">.</w:t>
-      </w:r>
-    </w:p>
-    <w:p>
-      <w:pPr>
-        <w:spacing w:before="240" w:after="0"/>
-        <w:ind w:firstLine="0"/>
-        <w:jc w:val="left"/>
-      </w:pPr>
-      <w:r>
-        <w:rPr>
-          <w:rFonts w:ascii="Bebas Neue" w:hAnsi="Bebas Neue"/>
-          <w:caps/>
-          <w:color w:val="A9A9A4"/>
-          <w:spacing w:val="30"/>
-          <w:sz w:val="26"/>
-        </w:rPr>
-        <w:t xml:space="preserve">— A MITY</w:t>
       </w:r>
     </w:p>
     <w:p>
@@ -12332,7 +12286,7 @@
           <w:sz w:val="19"/>
           <w:szCs w:val="19"/>
         </w:rPr>
-        <w:t xml:space="preserve">CAPÍTULO 23 · 2021–2022</w:t>
+        <w:t xml:space="preserve">CAPÍTULO 23 · 2020–2022</w:t>
       </w:r>
     </w:p>
     <w:p>
@@ -12360,30 +12314,35 @@
         <w:rPr>
           <w:smallCaps/>
         </w:rPr>
-        <w:t xml:space="preserve">Voltamos de Okinawa em</w:t>
-      </w:r>
-      <w:r>
-        <w:t xml:space="preserve"> setembro com a dívida no bolso e a COVID no corpo.</w:t>
-      </w:r>
-    </w:p>
-    <w:p>
-      <w:r>
-        <w:t xml:space="preserve">Eu primeiro, depois ele, com dois dias de diferença. A febre começou na semana da volta, com as malas ainda fechadas no corredor, e veio como uma parede. O hokenjo, o centro de saúde da prefeitura, ligava todo dia de manhã para perguntar a temperatura e a oxigenação, e deixou na porta do apartamento uma caixa de papelão com arroz instantâneo, água, macarrão de copo e um oxímetro pequenininho, do tamanho de um prendedor de roupa, que a gente prendia no dedo e olhava como quem olha um oráculo.</w:t>
-      </w:r>
-    </w:p>
-    <w:p>
-      <w:r>
-        <w:t xml:space="preserve">Os números desceram. Os meus, depois os dele. Houve uma noite em que eu acordei sem ar, com o peito pesado como se tivesse uma pessoa sentada em cima, e prendi o oxímetro no dedo no escuro e vi o número piscar, e descer, e piscar. O Kousuke estava ao meu lado, pior do que eu, respirando curto, dormindo um sono ruim. As meninas estavam no quarto delas. Quem segurou a casa naqueles dias foram os amigos. Uma amiga da igreja deixava comida no genkan e conversava com as meninas pela porta fechada. Um casal da cidade fazia as compras e mandava foto da nota pelo celular. Alguém que eu mal conhecia deixou na porta um saco de laranjas com um bilhete em português: "Melhoras."</w:t>
-      </w:r>
-    </w:p>
-    <w:p>
-      <w:r>
-        <w:t xml:space="preserve">No grupo dos brasileiros da cidade, naquela semana, alguém escreveu que um conhecido de um conhecido não tinha voltado do hospital. Depois outro. Eu parei de abrir o grupo.</w:t>
-      </w:r>
-    </w:p>
-    <w:p>
-      <w:r>
-        <w:t xml:space="preserve">Tive medo de não voltar. Tive medo de deixar as duas. Tive medo de não dar tempo. Fiquei deitada de lado, no futon, com o oxímetro no dedo, olhando a porta do quarto delas, e rezei, pela primeira vez em muito tempo, pedindo uma coisa para mim.</w:t>
+        <w:t xml:space="preserve">Quando voltamos de Okinawa,</w:t>
+      </w:r>
+      <w:r>
+        <w:t xml:space="preserve"> eu voltei para a linha. Só que agora de noite.</w:t>
+      </w:r>
+    </w:p>
+    <w:p>
+      <w:r>
+        <w:t xml:space="preserve">Às três da manhã, na fábrica de marmitas, o arroz chegava numa esteira ainda soltando vapor.</w:t>
+      </w:r>
+    </w:p>
+    <w:p>
+      <w:r>
+        <w:t xml:space="preserve">Era o meu arubaito, o bico, o trabalho temporário que dava para pegar de um dia para o outro sem entrevista. Três noites por semana, das dez da noite às seis da manhã, de touca, máscara, avental e luvas de plástico, numa linha de senhoras japonesas e brasileiras que montavam os bentō das lojas de conveniência para o dia seguinte. Cada uma punha uma coisa. Eu punha o ovo. Um pedaço de omelete doce, amarelo, retangular, no canto esquerdo de cada caixinha, milhares de vezes por noite, até o ovo ficar pesado na mão.</w:t>
+      </w:r>
+    </w:p>
+    <w:p>
+      <w:r>
+        <w:t xml:space="preserve">A gente estava fora da fábrica fazia quase um ano, sem seguro-desemprego, com a dívida de Okinawa no bolso e nenhuma ideia nova. Quer dizer: o Kousuke tinha uma. Passava as noites estudando o mercado imobiliário, os bancos, os documentos que um estrangeiro precisava para comprar uma casa no Japão, e falava daquilo como oportunidade. Eu chamava, em silêncio, de mais uma.</w:t>
+      </w:r>
+    </w:p>
+    <w:p>
+      <w:r>
+        <w:t xml:space="preserve">Então fazíamos o que aparecia. Eu, a fábrica de marmitas. Ele, carregamento de caminhão num depósito aos sábados. Chegávamos em casa em horários trocados e deixávamos recado um para o outro colado na porta da geladeira, como dois colegas de turno.</w:t>
+      </w:r>
+    </w:p>
+    <w:p>
+      <w:r>
+        <w:t xml:space="preserve">Naquele fim de ano, numa tarde de novembro, no meio dos turnos da madrugada, eu fui até uma ponte num vale e pulei de bungee jump pela primeira vez. Cinquenta metros. Ninguém entendeu por quê, e eu também não sabia explicar. Sabia que ia sozinha, com o meu medo, e que lá em cima ninguém podia pular por mim. Achei que ia morrer. Não morri.</w:t>
       </w:r>
     </w:p>
     <w:p>
@@ -12402,42 +12361,42 @@
         <w:ind w:firstLine="0"/>
       </w:pPr>
       <w:r>
-        <w:t xml:space="preserve">Minha mãe chegou quando a gente já não estava morrendo, mas ainda não conseguia levantar.</w:t>
-      </w:r>
-    </w:p>
-    <w:p>
-      <w:r>
-        <w:t xml:space="preserve">Tinha vindo do Brasil assim que soube, para cuidar das meninas, com o visto que ainda valia, depois de uma quarentena que passou num hotel perto do aeroporto, reclamando da comida, por mensagem, três vezes por dia. Chegou de máscara dupla, com a mesma mala azul amarrada com fita vermelha, e antes de tirar o sapato no genkan já estava perguntando onde eu guardava a panela grande.</w:t>
-      </w:r>
-    </w:p>
-    <w:p>
-      <w:r>
-        <w:t xml:space="preserve">Naquela noite, eu acordei com o cheiro.</w:t>
-      </w:r>
-    </w:p>
-    <w:p>
-      <w:r>
-        <w:t xml:space="preserve">Era canja. Canja de galinha com arroz, do jeito que ela fazia quando eu era pequena e ficava de cama, com salsinha e um fio de óleo por cima. O cheiro entrava pela fresta da porta do quarto, e eu fiquei deitada respirando aquele cheiro devagar, com o pulmão que ainda doía, porque era a primeira coisa em dez dias que tinha gosto de alguma coisa.</w:t>
-      </w:r>
-    </w:p>
-    <w:p>
-      <w:r>
-        <w:t xml:space="preserve">A porta abriu. Minha mãe entrou com uma bandeja. Tinha achado, no fundo do armário, as duas únicas tigelas boas que a gente tinha, as de borda azul, e tinha posto uma colher em cada uma, e um guardanapo de papel dobrado em triângulo, e dois copos de água.</w:t>
-      </w:r>
-    </w:p>
-    <w:p>
-      <w:r>
-        <w:t xml:space="preserve">Ela pôs a bandeja em cima do futon, entre mim e o Kousuke, e se sentou no chão, de joelhos, esperando.</w:t>
-      </w:r>
-    </w:p>
-    <w:p>
-      <w:r>
-        <w:t xml:space="preserve">Eu olhei para aquela bandeja por muito tempo. Tinha servido café para uma sala inteira aos quinze anos. Tinha deixado panela no fogão do meu pai à meia-noite, por anos. Tinha descascado pera num quarto de hospital. Nunca, que eu lembrasse, ninguém tinha trazido uma bandeja para mim.</w:t>
-      </w:r>
-    </w:p>
-    <w:p>
-      <w:r>
-        <w:t xml:space="preserve">— Come, filha — disse ela. — Está quente.</w:t>
+        <w:t xml:space="preserve">No dia 24 de junho de 2021, de manhã, eu estacionei na frente do zeimusho de Kariya, a repartição de impostos da região.</w:t>
+      </w:r>
+    </w:p>
+    <w:p>
+      <w:r>
+        <w:t xml:space="preserve">Era um prédio cinza, sem graça, como todas as repartições do mundo. Eu tinha na bolsa uma pasta de plástico com dois formulários, preenchidos a lápis primeiro e depois a caneta, com a ajuda de um vídeo no YouTube e de um dicionário de kanji: o kaigyō todoke, a comunicação de abertura de atividade como empresária individual, e o pedido de autorização para fazer a declaração de imposto "azul", a dos pequenos negócios. No campo do ramo de atividade eu tinha escrito, em letras de forma, DIGITAL MARKETING. No campo do nome comercial, depois de três semanas de dúvida, eu tinha escrito LUMI DIGITAL. O meu nome do meio. O que ninguém usava.</w:t>
+      </w:r>
+    </w:p>
+    <w:p>
+      <w:r>
+        <w:t xml:space="preserve">A funcionária do guichê leu os dois formulários com atenção, virou as folhas, conferiu os campos um por um. Pediu um documento. Olhou para mim. Pegou um carimbo redondo, azul, molhou na almofada e bateu uma vez em cada formulário, no canto de cima, com um barulho seco.</w:t>
+      </w:r>
+    </w:p>
+    <w:p>
+      <w:r>
+        <w:t xml:space="preserve">Depois me devolveu as cópias.</w:t>
+      </w:r>
+    </w:p>
+    <w:p>
+      <w:r>
+        <w:t xml:space="preserve">Eu saí do prédio, sentei no carro e fiquei olhando o carimbo. Era um círculo azul com a data dentro, em números japoneses, e o nome da repartição em kanji em volta. Era só um carimbo. Era a minha primeira empresa.</w:t>
+      </w:r>
+    </w:p>
+    <w:p>
+      <w:r>
+        <w:t xml:space="preserve">Tirei uma foto da folha em cima do volante, com cuidado para o reflexo do sol não apagar a data, e mandei para a minha mãe no Brasil, onde eram nove e pouco da noite.</w:t>
+      </w:r>
+    </w:p>
+    <w:p>
+      <w:r>
+        <w:t xml:space="preserve">Ela respondeu em menos de um minuto, como sempre.</w:t>
+      </w:r>
+    </w:p>
+    <w:p>
+      <w:r>
+        <w:t xml:space="preserve">"O que é isso, filha?"</w:t>
       </w:r>
     </w:p>
     <w:p>
@@ -12456,27 +12415,86 @@
         <w:ind w:firstLine="0"/>
       </w:pPr>
       <w:r>
-        <w:t xml:space="preserve">Quando consegui ficar em pé, voltei para a linha.</w:t>
-      </w:r>
-    </w:p>
-    <w:p>
-      <w:r>
-        <w:t xml:space="preserve">Às três da manhã, na fábrica de marmitas, o arroz chegava numa esteira ainda soltando vapor.</w:t>
-      </w:r>
-    </w:p>
-    <w:p>
-      <w:r>
-        <w:t xml:space="preserve">Era o meu arubaito, o bico, o trabalho temporário que dava para pegar de um dia para o outro sem entrevista. Três noites por semana, das dez da noite às seis da manhã, de touca, máscara, avental e luvas de plástico, numa linha de senhoras japonesas e brasileiras que montavam os bentō das lojas de conveniência para o dia seguinte. Cada uma punha uma coisa. Eu punha o ovo. Um pedaço de omelete doce, amarelo, retangular, no canto esquerdo de cada caixinha, milhares de vezes por noite, até o ovo ficar pesado na mão.</w:t>
-      </w:r>
-    </w:p>
-    <w:p>
-      <w:r>
-        <w:t xml:space="preserve">A gente estava fora da fábrica fazia mais de seis meses, sem seguro-desemprego, com a dívida de Okinawa no bolso e nenhuma ideia nova. Quer dizer: o Kousuke tinha uma. Passava as noites estudando o mercado imobiliário, os bancos, os documentos que um estrangeiro precisava para comprar uma casa no Japão, e falava daquilo como oportunidade. Eu chamava, em silêncio, de mais uma. Minha mãe, que ainda estava com a gente, ouvia os dois da cozinha e não dava opinião, o que nela era uma opinião.</w:t>
-      </w:r>
-    </w:p>
-    <w:p>
-      <w:r>
-        <w:t xml:space="preserve">Então fazíamos o que aparecia. Eu, a fábrica de marmitas. Ele, carregamento de caminhão num depósito aos sábados. Chegávamos em casa em horários trocados e deixávamos recado um para o outro colado na porta da geladeira, como dois colegas de turno.</w:t>
+        <w:t xml:space="preserve">Em setembro de 2021, voltamos a Okinawa, dessa vez sem food truck nenhum, para o meu aniversário. Fiz trinta e três anos numa ilhazinha perto da costa, dessas que se atravessa de barco em quinze minutos, de pé numa prancha, numa água tão rasa e tão azul que parecia de mentira. Quem visse a foto ia achar que a gente nunca tinha perdido nada naquela ilha.</w:t>
+      </w:r>
+    </w:p>
+    <w:p>
+      <w:r>
+        <w:t xml:space="preserve">Voltamos de lá com a COVID no corpo.</w:t>
+      </w:r>
+    </w:p>
+    <w:p>
+      <w:r>
+        <w:t xml:space="preserve">Eu primeiro, depois ele, com dois dias de diferença. A febre começou na semana da volta, com as malas ainda fechadas no corredor, e veio como uma parede. O hokenjo, o centro de saúde da prefeitura, ligava todo dia de manhã para perguntar a temperatura e a oxigenação, e deixou na porta do apartamento uma caixa de papelão com arroz instantâneo, água, macarrão de copo e um oxímetro pequenininho, do tamanho de um prendedor de roupa, que a gente prendia no dedo e olhava como quem olha um oráculo.</w:t>
+      </w:r>
+    </w:p>
+    <w:p>
+      <w:r>
+        <w:t xml:space="preserve">Os números desceram. Os meus, depois os dele. Houve uma noite em que eu acordei sem ar, com o peito pesado como se tivesse uma pessoa sentada em cima, e prendi o oxímetro no dedo no escuro e vi o número piscar, e descer, e piscar. O Kousuke estava ao meu lado, pior do que eu, respirando curto, dormindo um sono ruim. As meninas estavam no quarto delas. Quem segurou a casa naqueles dias foram os amigos. Uma amiga da igreja deixava comida no genkan e conversava com as meninas pela porta fechada. Um casal da cidade fazia as compras e mandava foto da nota pelo celular. Alguém que eu mal conhecia deixou na porta um saco de laranjas com um bilhete em português: "Melhoras."</w:t>
+      </w:r>
+    </w:p>
+    <w:p>
+      <w:r>
+        <w:t xml:space="preserve">No grupo dos brasileiros da cidade, naquela semana, alguém escreveu que um conhecido de um conhecido não tinha voltado do hospital. Depois outro. Eu parei de abrir o grupo.</w:t>
+      </w:r>
+    </w:p>
+    <w:p>
+      <w:r>
+        <w:t xml:space="preserve">Tive medo de não voltar. Tive medo de deixar as duas. Tive medo de não dar tempo. Fiquei deitada de lado, no futon, com o oxímetro no dedo, olhando a porta do quarto delas, e rezei, pela primeira vez em muito tempo, pedindo uma coisa para mim.</w:t>
+      </w:r>
+    </w:p>
+    <w:p>
+      <w:pPr>
+        <w:keepNext/>
+        <w:spacing w:before="200" w:after="200"/>
+        <w:ind w:firstLine="0"/>
+        <w:jc w:val="center"/>
+      </w:pPr>
+      <w:r>
+        <w:t xml:space="preserve">*   *   *</w:t>
+      </w:r>
+    </w:p>
+    <w:p>
+      <w:pPr>
+        <w:ind w:firstLine="0"/>
+      </w:pPr>
+      <w:r>
+        <w:t xml:space="preserve">Minha mãe chegou quando a gente já não estava morrendo, mas ainda não conseguia levantar.</w:t>
+      </w:r>
+    </w:p>
+    <w:p>
+      <w:r>
+        <w:t xml:space="preserve">Tinha vindo do Brasil assim que soube, para cuidar das meninas, com o visto que ainda valia, depois de uma quarentena que passou num hotel perto do aeroporto, reclamando da comida, por mensagem, três vezes por dia. Chegou de máscara dupla, com a mesma mala azul amarrada com fita vermelha, e antes de tirar o sapato no genkan já estava perguntando onde eu guardava a panela grande.</w:t>
+      </w:r>
+    </w:p>
+    <w:p>
+      <w:r>
+        <w:t xml:space="preserve">Naquela noite, eu acordei com o cheiro.</w:t>
+      </w:r>
+    </w:p>
+    <w:p>
+      <w:r>
+        <w:t xml:space="preserve">Era canja. Canja de galinha com arroz, do jeito que ela fazia quando eu era pequena e ficava de cama, com salsinha e um fio de óleo por cima. O cheiro entrava pela fresta da porta do quarto, e eu fiquei deitada respirando aquele cheiro devagar, com o pulmão que ainda doía, porque era a primeira coisa em dez dias que tinha gosto de alguma coisa.</w:t>
+      </w:r>
+    </w:p>
+    <w:p>
+      <w:r>
+        <w:t xml:space="preserve">A porta abriu. Minha mãe entrou com uma bandeja. Tinha achado, no fundo do armário, as duas únicas tigelas boas que a gente tinha, as de borda azul, e tinha posto uma colher em cada uma, e um guardanapo de papel dobrado em triângulo, e dois copos de água.</w:t>
+      </w:r>
+    </w:p>
+    <w:p>
+      <w:r>
+        <w:t xml:space="preserve">Ela pôs a bandeja em cima do futon, entre mim e o Kousuke, e se sentou no chão, de joelhos, esperando.</w:t>
+      </w:r>
+    </w:p>
+    <w:p>
+      <w:r>
+        <w:t xml:space="preserve">Eu olhei para aquela bandeja por muito tempo. Tinha servido café para uma sala inteira aos quinze anos. Tinha deixado panela no fogão do meu pai à meia-noite, por anos. Tinha descascado pera num quarto de hospital. Nunca, que eu lembrasse, ninguém tinha trazido uma bandeja para mim.</w:t>
+      </w:r>
+    </w:p>
+    <w:p>
+      <w:r>
+        <w:t xml:space="preserve">— Come, filha — disse ela. — Está quente.</w:t>
       </w:r>
     </w:p>
     <w:p>
@@ -19776,7 +19794,7 @@
         <w:i/>
         <w:sz w:val="17"/>
       </w:rPr>
-      <w:t xml:space="preserve">OKINAWA</w:t>
+      <w:t xml:space="preserve">O QUE SOBROU QUANDO DEU ERRADO</w:t>
     </w:r>
   </w:p>
 </w:hdr>

</xml_diff>

<commit_message>
A Menina Elefante: Okinawa em agosto de 2021, COVID na volta, Brasil até março de 2022
- Cap. 22: idades das meninas no texto da Luciana (7 e 5 anos); ano 2021.
- Caps. 21 e 23 voltam à ordem anterior, com a saída da fábrica no
  segundo semestre de 2020.
- Bíblia, decisões, .docx e PDF atualizados.

Co-Authored-By: Claude Opus 5.5 <noreply@anthropic.com>
Claude-Session: https://claude.ai/code/session_011ZTeK22H8KBNtWenzEUTZE
</commit_message>
<xml_diff>
--- a/menina_elefante/saidas/A_Menina_Elefante_V4.docx
+++ b/menina_elefante/saidas/A_Menina_Elefante_V4.docx
@@ -11056,7 +11056,7 @@
           <w:sz w:val="22"/>
           <w:szCs w:val="22"/>
         </w:rPr>
-        <w:t xml:space="preserve">2019–2022</w:t>
+        <w:t xml:space="preserve">2020–2022</w:t>
       </w:r>
     </w:p>
     <w:p>
@@ -11137,7 +11137,7 @@
           <w:sz w:val="19"/>
           <w:szCs w:val="19"/>
         </w:rPr>
-        <w:t xml:space="preserve">CAPÍTULO 21 · 2019–2020</w:t>
+        <w:t xml:space="preserve">CAPÍTULO 21 · 2020–2021</w:t>
       </w:r>
     </w:p>
     <w:p>
@@ -11207,7 +11207,7 @@
     </w:p>
     <w:p>
       <w:r>
-        <w:t xml:space="preserve">Eu fui a segunda. Numa noite de 2019, com a minha mãe já em remissão, dormindo no quarto das meninas, eu comprei um curso de marketing digital. Oito mil reais, em doze vezes no cartão brasileiro que eu ainda tinha. Era muito dinheiro para a gente. Era o dinheiro de uma passagem para o Brasil. Eu comprei às duas da manhã, deitada no futon, com o Kousuke dormindo do lado, e só contei a ele no dia seguinte, no ônibus da empreiteira, falando baixo para os outros não ouvirem.</w:t>
+        <w:t xml:space="preserve">Eu fui a segunda. Numa noite de 2020, depois que minha mãe voltou para o Brasil e o apartamento ficou grande demais para quatro pessoas, eu comprei um curso de marketing digital. Oito mil reais, em doze vezes no cartão brasileiro que eu ainda tinha. Era muito dinheiro para a gente. Era o dinheiro de uma passagem para o Brasil. Eu comprei às duas da manhã, deitada no futon, com o Kousuke dormindo do lado, e só contei a ele no dia seguinte, no ônibus da empreiteira, falando baixo para os outros não ouvirem.</w:t>
       </w:r>
     </w:p>
     <w:p>
@@ -11502,17 +11502,71 @@
     </w:p>
     <w:p>
       <w:r>
-        <w:t xml:space="preserve">Saímos da fábrica no fim de 2019, sem plano B. Na última tarde, eu entreguei o uniforme cinza dobrado ao encarregado, que se curvou e disse alguma coisa educada que eu não entendi. Na saída, olhei para trás, para o galpão, e senti menos alívio do que medo.</w:t>
-      </w:r>
-    </w:p>
-    <w:p>
-      <w:r>
-        <w:t xml:space="preserve">O lançamento veio no começo de 2020, na mesma semana em que o mundo começou a falar em pandemia. Não foi um desastre. Algumas pessoas compraram. Algumas mandaram mensagens bonitas. Mas não sustentava a casa. Não pagava o aluguel e a escola e a parcela e o arroz. Não mudava tudo, como eu tinha imaginado nas noites de futon.</w:t>
-      </w:r>
-    </w:p>
-    <w:p>
-      <w:r>
-        <w:t xml:space="preserve">Na noite em que fechamos as contas do lançamento, o Kousuke abriu o caderno de planilhas e, pela primeira vez, não começou uma aba nova. Ficou olhando a última linha, com o bilhete colado de durex na mesma página, e a luz de anel ainda montada no canto da sala, apagada.</w:t>
+        <w:t xml:space="preserve">Saímos da fábrica no segundo semestre de 2020, sem plano B. Na última tarde, eu entreguei o uniforme cinza dobrado ao encarregado, que se curvou e disse alguma coisa educada que eu não entendi. Na saída, olhei para trás, para o galpão, e senti menos alívio do que medo.</w:t>
+      </w:r>
+    </w:p>
+    <w:p>
+      <w:r>
+        <w:t xml:space="preserve">O lançamento veio. Não foi um desastre. Algumas pessoas compraram. Algumas mandaram mensagens bonitas. Mas não sustentava a casa. Não pagava o aluguel e a escola e a parcela e o arroz. Não mudava tudo, como eu tinha imaginado nas noites de futon.</w:t>
+      </w:r>
+    </w:p>
+    <w:p>
+      <w:r>
+        <w:t xml:space="preserve">Naquele fim de ano, numa tarde de novembro, eu fui até uma ponte num vale e pulei de bungee jump pela primeira vez. Cinquenta metros. Ninguém entendeu por quê, e eu também não sabia explicar. Sabia que ia sozinha, com o meu medo, e que lá em cima ninguém podia pular por mim. Achei que ia morrer. Não morri.</w:t>
+      </w:r>
+    </w:p>
+    <w:p>
+      <w:pPr>
+        <w:keepNext/>
+        <w:spacing w:before="200" w:after="200"/>
+        <w:ind w:firstLine="0"/>
+        <w:jc w:val="center"/>
+      </w:pPr>
+      <w:r>
+        <w:t xml:space="preserve">*   *   *</w:t>
+      </w:r>
+    </w:p>
+    <w:p>
+      <w:pPr>
+        <w:ind w:firstLine="0"/>
+      </w:pPr>
+      <w:r>
+        <w:t xml:space="preserve">No dia 24 de junho de 2021, de manhã, eu estacionei na frente do zeimusho de Kariya, a repartição de impostos da região.</w:t>
+      </w:r>
+    </w:p>
+    <w:p>
+      <w:r>
+        <w:t xml:space="preserve">Era um prédio cinza, sem graça, como todas as repartições do mundo. Eu tinha na bolsa uma pasta de plástico com dois formulários, preenchidos a lápis primeiro e depois a caneta, com a ajuda de um vídeo no YouTube e de um dicionário de kanji: o kaigyō todoke, a comunicação de abertura de atividade como empresária individual, e o pedido de autorização para fazer a declaração de imposto "azul", a dos pequenos negócios. No campo do ramo de atividade eu tinha escrito, em letras de forma, DIGITAL MARKETING. No campo do nome comercial, depois de três semanas de dúvida, eu tinha escrito LUMI DIGITAL. O meu nome do meio. O que ninguém usava.</w:t>
+      </w:r>
+    </w:p>
+    <w:p>
+      <w:r>
+        <w:t xml:space="preserve">A funcionária do guichê leu os dois formulários com atenção, virou as folhas, conferiu os campos um por um. Pediu um documento. Olhou para mim. Pegou um carimbo redondo, azul, molhou na almofada e bateu uma vez em cada formulário, no canto de cima, com um barulho seco.</w:t>
+      </w:r>
+    </w:p>
+    <w:p>
+      <w:r>
+        <w:t xml:space="preserve">Depois me devolveu as cópias.</w:t>
+      </w:r>
+    </w:p>
+    <w:p>
+      <w:r>
+        <w:t xml:space="preserve">Eu saí do prédio, sentei no carro e fiquei olhando o carimbo. Era um círculo azul com a data dentro, em números japoneses, e o nome da repartição em kanji em volta. Era só um carimbo. Era a minha primeira empresa.</w:t>
+      </w:r>
+    </w:p>
+    <w:p>
+      <w:r>
+        <w:t xml:space="preserve">Tirei uma foto da folha em cima do volante, com cuidado para o reflexo do sol não apagar a data, e mandei para a minha mãe no Brasil, onde eram nove e pouco da noite.</w:t>
+      </w:r>
+    </w:p>
+    <w:p>
+      <w:r>
+        <w:t xml:space="preserve">Ela respondeu em menos de um minuto, como sempre.</w:t>
+      </w:r>
+    </w:p>
+    <w:p>
+      <w:r>
+        <w:t xml:space="preserve">"O que é isso, filha?"</w:t>
       </w:r>
     </w:p>
     <w:p>
@@ -11609,7 +11663,7 @@
           <w:sz w:val="22"/>
           <w:szCs w:val="22"/>
         </w:rPr>
-        <w:t xml:space="preserve">Aprendi duas coisas naquele tempo. A primeira: toda decisão grande tem um custo para quem está ao seu lado. O Kousuke entrou "por mim", e a cara que aparecia na tela era a dele. Eu devia ter perguntado mais vezes como ele estava. A segunda: não espere que todo mundo entenda o seu sonho. No refeitório da fábrica, me perguntaram se era pirâmide. Nem sempre quem está perto entende o que estamos construindo. E tudo bem.</w:t>
+        <w:t xml:space="preserve">Aprendi duas coisas naquele tempo. A primeira: toda decisão grande tem um custo para quem está ao seu lado. O Kousuke entrou "por mim", e a cara que aparecia na tela era a dele. Eu devia ter perguntado mais vezes como ele estava. A segunda: não espere que todo mundo entenda o seu sonho. Minha mãe perguntou "o que é isso, filha?" diante do carimbo da minha primeira empresa. Nem sempre quem nos ama entende o que estamos construindo. E tudo bem.</w:t>
       </w:r>
     </w:p>
     <w:p>
@@ -11703,7 +11757,7 @@
           <w:sz w:val="19"/>
           <w:szCs w:val="19"/>
         </w:rPr>
-        <w:t xml:space="preserve">CAPÍTULO 22 · 2020</w:t>
+        <w:t xml:space="preserve">CAPÍTULO 22 · 2021</w:t>
       </w:r>
     </w:p>
     <w:p>
@@ -11769,7 +11823,7 @@
     </w:p>
     <w:p>
       <w:r>
-        <w:t xml:space="preserve">Nós já tínhamos tentado empreender no digital, com o lançamento de um curso sobre finanças que não trouxe retorno financeiro. Estávamos havia quase um ano fora da fábrica, sem seguro-desemprego, com duas filhas pequenas. A Ayumi tinha seis anos. A Mity, quatro. Não havia dinheiro sobrando para uma nova aposta.</w:t>
+        <w:t xml:space="preserve">Nós já tínhamos tentado empreender no digital, com o lançamento de um curso sobre finanças que não trouxe retorno financeiro. Estávamos havia quase um ano fora da fábrica, sem seguro-desemprego, com duas filhas pequenas. A Ayumi tinha sete anos. A Mity, cinco. Não havia dinheiro sobrando para uma nova aposta.</w:t>
       </w:r>
     </w:p>
     <w:p>
@@ -11874,7 +11928,7 @@
     </w:p>
     <w:p>
       <w:r>
-        <w:t xml:space="preserve">Ele ficou no quarto escuro, sem reação, sem saber o que falar, fazer ou comer. As meninas queriam brincar. Tinham quatro e seis anos. Para elas, o pai continuava sendo o pai, mesmo quando ele não sabia como responder ao que estava acontecendo.</w:t>
+        <w:t xml:space="preserve">Ele ficou no quarto escuro, sem reação, sem saber o que falar, fazer ou comer. As meninas queriam brincar. Tinham cinco e sete anos. Para elas, o pai continuava sendo o pai, mesmo quando ele não sabia como responder ao que estava acontecendo.</w:t>
       </w:r>
     </w:p>
     <w:p>
@@ -12286,7 +12340,7 @@
           <w:sz w:val="19"/>
           <w:szCs w:val="19"/>
         </w:rPr>
-        <w:t xml:space="preserve">CAPÍTULO 23 · 2020–2022</w:t>
+        <w:t xml:space="preserve">CAPÍTULO 23 · 2021–2022</w:t>
       </w:r>
     </w:p>
     <w:p>
@@ -12314,35 +12368,30 @@
         <w:rPr>
           <w:smallCaps/>
         </w:rPr>
-        <w:t xml:space="preserve">Quando voltamos de Okinawa,</w:t>
-      </w:r>
-      <w:r>
-        <w:t xml:space="preserve"> eu voltei para a linha. Só que agora de noite.</w:t>
-      </w:r>
-    </w:p>
-    <w:p>
-      <w:r>
-        <w:t xml:space="preserve">Às três da manhã, na fábrica de marmitas, o arroz chegava numa esteira ainda soltando vapor.</w:t>
-      </w:r>
-    </w:p>
-    <w:p>
-      <w:r>
-        <w:t xml:space="preserve">Era o meu arubaito, o bico, o trabalho temporário que dava para pegar de um dia para o outro sem entrevista. Três noites por semana, das dez da noite às seis da manhã, de touca, máscara, avental e luvas de plástico, numa linha de senhoras japonesas e brasileiras que montavam os bentō das lojas de conveniência para o dia seguinte. Cada uma punha uma coisa. Eu punha o ovo. Um pedaço de omelete doce, amarelo, retangular, no canto esquerdo de cada caixinha, milhares de vezes por noite, até o ovo ficar pesado na mão.</w:t>
-      </w:r>
-    </w:p>
-    <w:p>
-      <w:r>
-        <w:t xml:space="preserve">A gente estava fora da fábrica fazia quase um ano, sem seguro-desemprego, com a dívida de Okinawa no bolso e nenhuma ideia nova. Quer dizer: o Kousuke tinha uma. Passava as noites estudando o mercado imobiliário, os bancos, os documentos que um estrangeiro precisava para comprar uma casa no Japão, e falava daquilo como oportunidade. Eu chamava, em silêncio, de mais uma.</w:t>
-      </w:r>
-    </w:p>
-    <w:p>
-      <w:r>
-        <w:t xml:space="preserve">Então fazíamos o que aparecia. Eu, a fábrica de marmitas. Ele, carregamento de caminhão num depósito aos sábados. Chegávamos em casa em horários trocados e deixávamos recado um para o outro colado na porta da geladeira, como dois colegas de turno.</w:t>
-      </w:r>
-    </w:p>
-    <w:p>
-      <w:r>
-        <w:t xml:space="preserve">Naquele fim de ano, numa tarde de novembro, no meio dos turnos da madrugada, eu fui até uma ponte num vale e pulei de bungee jump pela primeira vez. Cinquenta metros. Ninguém entendeu por quê, e eu também não sabia explicar. Sabia que ia sozinha, com o meu medo, e que lá em cima ninguém podia pular por mim. Achei que ia morrer. Não morri.</w:t>
+        <w:t xml:space="preserve">Voltamos de Okinawa em</w:t>
+      </w:r>
+      <w:r>
+        <w:t xml:space="preserve"> setembro de 2021 com a dívida no bolso e a COVID no corpo.</w:t>
+      </w:r>
+    </w:p>
+    <w:p>
+      <w:r>
+        <w:t xml:space="preserve">Eu primeiro, depois ele, com dois dias de diferença. A febre começou na semana da volta, com as malas ainda fechadas no corredor, e veio como uma parede. O hokenjo, o centro de saúde da prefeitura, ligava todo dia de manhã para perguntar a temperatura e a oxigenação, e deixou na porta do apartamento uma caixa de papelão com arroz instantâneo, água, macarrão de copo e um oxímetro pequenininho, do tamanho de um prendedor de roupa, que a gente prendia no dedo e olhava como quem olha um oráculo.</w:t>
+      </w:r>
+    </w:p>
+    <w:p>
+      <w:r>
+        <w:t xml:space="preserve">Os números desceram. Os meus, depois os dele. Houve uma noite em que eu acordei sem ar, com o peito pesado como se tivesse uma pessoa sentada em cima, e prendi o oxímetro no dedo no escuro e vi o número piscar, e descer, e piscar. O Kousuke estava ao meu lado, pior do que eu, respirando curto, dormindo um sono ruim. As meninas estavam no quarto delas. Quem segurou a casa naqueles dias foram os amigos. Uma amiga da igreja deixava comida no genkan e conversava com as meninas pela porta fechada. Um casal da cidade fazia as compras e mandava foto da nota pelo celular. Alguém que eu mal conhecia deixou na porta um saco de laranjas com um bilhete em português: "Melhoras."</w:t>
+      </w:r>
+    </w:p>
+    <w:p>
+      <w:r>
+        <w:t xml:space="preserve">No grupo dos brasileiros da cidade, naquela semana, alguém escreveu que um conhecido de um conhecido não tinha voltado do hospital. Depois outro. Eu parei de abrir o grupo.</w:t>
+      </w:r>
+    </w:p>
+    <w:p>
+      <w:r>
+        <w:t xml:space="preserve">Tive medo de não voltar. Tive medo de deixar as duas. Tive medo de não dar tempo. Fiquei deitada de lado, no futon, com o oxímetro no dedo, olhando a porta do quarto delas, e rezei, pela primeira vez em muito tempo, pedindo uma coisa para mim.</w:t>
       </w:r>
     </w:p>
     <w:p>
@@ -12361,42 +12410,42 @@
         <w:ind w:firstLine="0"/>
       </w:pPr>
       <w:r>
-        <w:t xml:space="preserve">No dia 24 de junho de 2021, de manhã, eu estacionei na frente do zeimusho de Kariya, a repartição de impostos da região.</w:t>
-      </w:r>
-    </w:p>
-    <w:p>
-      <w:r>
-        <w:t xml:space="preserve">Era um prédio cinza, sem graça, como todas as repartições do mundo. Eu tinha na bolsa uma pasta de plástico com dois formulários, preenchidos a lápis primeiro e depois a caneta, com a ajuda de um vídeo no YouTube e de um dicionário de kanji: o kaigyō todoke, a comunicação de abertura de atividade como empresária individual, e o pedido de autorização para fazer a declaração de imposto "azul", a dos pequenos negócios. No campo do ramo de atividade eu tinha escrito, em letras de forma, DIGITAL MARKETING. No campo do nome comercial, depois de três semanas de dúvida, eu tinha escrito LUMI DIGITAL. O meu nome do meio. O que ninguém usava.</w:t>
-      </w:r>
-    </w:p>
-    <w:p>
-      <w:r>
-        <w:t xml:space="preserve">A funcionária do guichê leu os dois formulários com atenção, virou as folhas, conferiu os campos um por um. Pediu um documento. Olhou para mim. Pegou um carimbo redondo, azul, molhou na almofada e bateu uma vez em cada formulário, no canto de cima, com um barulho seco.</w:t>
-      </w:r>
-    </w:p>
-    <w:p>
-      <w:r>
-        <w:t xml:space="preserve">Depois me devolveu as cópias.</w:t>
-      </w:r>
-    </w:p>
-    <w:p>
-      <w:r>
-        <w:t xml:space="preserve">Eu saí do prédio, sentei no carro e fiquei olhando o carimbo. Era um círculo azul com a data dentro, em números japoneses, e o nome da repartição em kanji em volta. Era só um carimbo. Era a minha primeira empresa.</w:t>
-      </w:r>
-    </w:p>
-    <w:p>
-      <w:r>
-        <w:t xml:space="preserve">Tirei uma foto da folha em cima do volante, com cuidado para o reflexo do sol não apagar a data, e mandei para a minha mãe no Brasil, onde eram nove e pouco da noite.</w:t>
-      </w:r>
-    </w:p>
-    <w:p>
-      <w:r>
-        <w:t xml:space="preserve">Ela respondeu em menos de um minuto, como sempre.</w:t>
-      </w:r>
-    </w:p>
-    <w:p>
-      <w:r>
-        <w:t xml:space="preserve">"O que é isso, filha?"</w:t>
+        <w:t xml:space="preserve">Minha mãe chegou quando a gente já não estava morrendo, mas ainda não conseguia levantar.</w:t>
+      </w:r>
+    </w:p>
+    <w:p>
+      <w:r>
+        <w:t xml:space="preserve">Tinha vindo do Brasil assim que soube, para cuidar das meninas, com o visto que ainda valia, depois de uma quarentena que passou num hotel perto do aeroporto, reclamando da comida, por mensagem, três vezes por dia. Chegou de máscara dupla, com a mesma mala azul amarrada com fita vermelha, e antes de tirar o sapato no genkan já estava perguntando onde eu guardava a panela grande.</w:t>
+      </w:r>
+    </w:p>
+    <w:p>
+      <w:r>
+        <w:t xml:space="preserve">Naquela noite, eu acordei com o cheiro.</w:t>
+      </w:r>
+    </w:p>
+    <w:p>
+      <w:r>
+        <w:t xml:space="preserve">Era canja. Canja de galinha com arroz, do jeito que ela fazia quando eu era pequena e ficava de cama, com salsinha e um fio de óleo por cima. O cheiro entrava pela fresta da porta do quarto, e eu fiquei deitada respirando aquele cheiro devagar, com o pulmão que ainda doía, porque era a primeira coisa em dez dias que tinha gosto de alguma coisa.</w:t>
+      </w:r>
+    </w:p>
+    <w:p>
+      <w:r>
+        <w:t xml:space="preserve">A porta abriu. Minha mãe entrou com uma bandeja. Tinha achado, no fundo do armário, as duas únicas tigelas boas que a gente tinha, as de borda azul, e tinha posto uma colher em cada uma, e um guardanapo de papel dobrado em triângulo, e dois copos de água.</w:t>
+      </w:r>
+    </w:p>
+    <w:p>
+      <w:r>
+        <w:t xml:space="preserve">Ela pôs a bandeja em cima do futon, entre mim e o Kousuke, e se sentou no chão, de joelhos, esperando.</w:t>
+      </w:r>
+    </w:p>
+    <w:p>
+      <w:r>
+        <w:t xml:space="preserve">Eu olhei para aquela bandeja por muito tempo. Tinha servido café para uma sala inteira aos quinze anos. Tinha deixado panela no fogão do meu pai à meia-noite, por anos. Tinha descascado pera num quarto de hospital. Nunca, que eu lembrasse, ninguém tinha trazido uma bandeja para mim.</w:t>
+      </w:r>
+    </w:p>
+    <w:p>
+      <w:r>
+        <w:t xml:space="preserve">— Come, filha — disse ela. — Está quente.</w:t>
       </w:r>
     </w:p>
     <w:p>
@@ -12415,86 +12464,27 @@
         <w:ind w:firstLine="0"/>
       </w:pPr>
       <w:r>
-        <w:t xml:space="preserve">Em setembro de 2021, voltamos a Okinawa, dessa vez sem food truck nenhum, para o meu aniversário. Fiz trinta e três anos numa ilhazinha perto da costa, dessas que se atravessa de barco em quinze minutos, de pé numa prancha, numa água tão rasa e tão azul que parecia de mentira. Quem visse a foto ia achar que a gente nunca tinha perdido nada naquela ilha.</w:t>
-      </w:r>
-    </w:p>
-    <w:p>
-      <w:r>
-        <w:t xml:space="preserve">Voltamos de lá com a COVID no corpo.</w:t>
-      </w:r>
-    </w:p>
-    <w:p>
-      <w:r>
-        <w:t xml:space="preserve">Eu primeiro, depois ele, com dois dias de diferença. A febre começou na semana da volta, com as malas ainda fechadas no corredor, e veio como uma parede. O hokenjo, o centro de saúde da prefeitura, ligava todo dia de manhã para perguntar a temperatura e a oxigenação, e deixou na porta do apartamento uma caixa de papelão com arroz instantâneo, água, macarrão de copo e um oxímetro pequenininho, do tamanho de um prendedor de roupa, que a gente prendia no dedo e olhava como quem olha um oráculo.</w:t>
-      </w:r>
-    </w:p>
-    <w:p>
-      <w:r>
-        <w:t xml:space="preserve">Os números desceram. Os meus, depois os dele. Houve uma noite em que eu acordei sem ar, com o peito pesado como se tivesse uma pessoa sentada em cima, e prendi o oxímetro no dedo no escuro e vi o número piscar, e descer, e piscar. O Kousuke estava ao meu lado, pior do que eu, respirando curto, dormindo um sono ruim. As meninas estavam no quarto delas. Quem segurou a casa naqueles dias foram os amigos. Uma amiga da igreja deixava comida no genkan e conversava com as meninas pela porta fechada. Um casal da cidade fazia as compras e mandava foto da nota pelo celular. Alguém que eu mal conhecia deixou na porta um saco de laranjas com um bilhete em português: "Melhoras."</w:t>
-      </w:r>
-    </w:p>
-    <w:p>
-      <w:r>
-        <w:t xml:space="preserve">No grupo dos brasileiros da cidade, naquela semana, alguém escreveu que um conhecido de um conhecido não tinha voltado do hospital. Depois outro. Eu parei de abrir o grupo.</w:t>
-      </w:r>
-    </w:p>
-    <w:p>
-      <w:r>
-        <w:t xml:space="preserve">Tive medo de não voltar. Tive medo de deixar as duas. Tive medo de não dar tempo. Fiquei deitada de lado, no futon, com o oxímetro no dedo, olhando a porta do quarto delas, e rezei, pela primeira vez em muito tempo, pedindo uma coisa para mim.</w:t>
-      </w:r>
-    </w:p>
-    <w:p>
-      <w:pPr>
-        <w:keepNext/>
-        <w:spacing w:before="200" w:after="200"/>
-        <w:ind w:firstLine="0"/>
-        <w:jc w:val="center"/>
-      </w:pPr>
-      <w:r>
-        <w:t xml:space="preserve">*   *   *</w:t>
-      </w:r>
-    </w:p>
-    <w:p>
-      <w:pPr>
-        <w:ind w:firstLine="0"/>
-      </w:pPr>
-      <w:r>
-        <w:t xml:space="preserve">Minha mãe chegou quando a gente já não estava morrendo, mas ainda não conseguia levantar.</w:t>
-      </w:r>
-    </w:p>
-    <w:p>
-      <w:r>
-        <w:t xml:space="preserve">Tinha vindo do Brasil assim que soube, para cuidar das meninas, com o visto que ainda valia, depois de uma quarentena que passou num hotel perto do aeroporto, reclamando da comida, por mensagem, três vezes por dia. Chegou de máscara dupla, com a mesma mala azul amarrada com fita vermelha, e antes de tirar o sapato no genkan já estava perguntando onde eu guardava a panela grande.</w:t>
-      </w:r>
-    </w:p>
-    <w:p>
-      <w:r>
-        <w:t xml:space="preserve">Naquela noite, eu acordei com o cheiro.</w:t>
-      </w:r>
-    </w:p>
-    <w:p>
-      <w:r>
-        <w:t xml:space="preserve">Era canja. Canja de galinha com arroz, do jeito que ela fazia quando eu era pequena e ficava de cama, com salsinha e um fio de óleo por cima. O cheiro entrava pela fresta da porta do quarto, e eu fiquei deitada respirando aquele cheiro devagar, com o pulmão que ainda doía, porque era a primeira coisa em dez dias que tinha gosto de alguma coisa.</w:t>
-      </w:r>
-    </w:p>
-    <w:p>
-      <w:r>
-        <w:t xml:space="preserve">A porta abriu. Minha mãe entrou com uma bandeja. Tinha achado, no fundo do armário, as duas únicas tigelas boas que a gente tinha, as de borda azul, e tinha posto uma colher em cada uma, e um guardanapo de papel dobrado em triângulo, e dois copos de água.</w:t>
-      </w:r>
-    </w:p>
-    <w:p>
-      <w:r>
-        <w:t xml:space="preserve">Ela pôs a bandeja em cima do futon, entre mim e o Kousuke, e se sentou no chão, de joelhos, esperando.</w:t>
-      </w:r>
-    </w:p>
-    <w:p>
-      <w:r>
-        <w:t xml:space="preserve">Eu olhei para aquela bandeja por muito tempo. Tinha servido café para uma sala inteira aos quinze anos. Tinha deixado panela no fogão do meu pai à meia-noite, por anos. Tinha descascado pera num quarto de hospital. Nunca, que eu lembrasse, ninguém tinha trazido uma bandeja para mim.</w:t>
-      </w:r>
-    </w:p>
-    <w:p>
-      <w:r>
-        <w:t xml:space="preserve">— Come, filha — disse ela. — Está quente.</w:t>
+        <w:t xml:space="preserve">Quando consegui ficar em pé, voltei para a linha.</w:t>
+      </w:r>
+    </w:p>
+    <w:p>
+      <w:r>
+        <w:t xml:space="preserve">Às três da manhã, na fábrica de marmitas, o arroz chegava numa esteira ainda soltando vapor.</w:t>
+      </w:r>
+    </w:p>
+    <w:p>
+      <w:r>
+        <w:t xml:space="preserve">Era o meu arubaito, o bico, o trabalho temporário que dava para pegar de um dia para o outro sem entrevista. Três noites por semana, das dez da noite às seis da manhã, de touca, máscara, avental e luvas de plástico, numa linha de senhoras japonesas e brasileiras que montavam os bentō das lojas de conveniência para o dia seguinte. Cada uma punha uma coisa. Eu punha o ovo. Um pedaço de omelete doce, amarelo, retangular, no canto esquerdo de cada caixinha, milhares de vezes por noite, até o ovo ficar pesado na mão.</w:t>
+      </w:r>
+    </w:p>
+    <w:p>
+      <w:r>
+        <w:t xml:space="preserve">A gente estava fora da fábrica fazia mais de um ano, sem seguro-desemprego, com a dívida de Okinawa no bolso e nenhuma ideia nova. Quer dizer: o Kousuke tinha uma. Passava as noites estudando o mercado imobiliário, os bancos, os documentos que um estrangeiro precisava para comprar uma casa no Japão, e falava daquilo como oportunidade. Eu chamava, em silêncio, de mais uma. Minha mãe, que ainda estava com a gente, ouvia os dois da cozinha e não dava opinião, o que nela era uma opinião.</w:t>
+      </w:r>
+    </w:p>
+    <w:p>
+      <w:r>
+        <w:t xml:space="preserve">Então fazíamos o que aparecia. Eu, a fábrica de marmitas. Ele, carregamento de caminhão num depósito aos sábados. Chegávamos em casa em horários trocados e deixávamos recado um para o outro colado na porta da geladeira, como dois colegas de turno.</w:t>
       </w:r>
     </w:p>
     <w:p>

</xml_diff>